<commit_message>
Word files: readiness documents with DOC-S16, and docs/31
Co-Authored-By: Claude Opus 5.5 <noreply@anthropic.com>
Claude-Session: https://claude.ai/code/session_012HHcRrzuvMBTL2FYxXtsyv
</commit_message>
<xml_diff>
--- a/treasury-platform/docs/30-readiness/word/DOC-S10-ubuntu-server-runbook.docx
+++ b/treasury-platform/docs/30-readiness/word/DOC-S10-ubuntu-server-runbook.docx
@@ -1261,7 +1261,29 @@
           <w:szCs w:val="21"/>
           <w:rtl/>
         </w:rPr>
-        <w:t xml:space="preserve">مضيف طبقة التطبيق: نظامه غير محسوم، وADR 0001 يبقيه على Windows Server حتى المراجعة (docs/adr/0001-schema-work-on-linux.md:3؛ DQ-B11-1). إن صار Ubuntu، تنطبق عليه الأقسام 6 و7 و8 كما هي.</w:t>
+        <w:t xml:space="preserve">مضيف طبقة التطبيق: </w:t>
+      </w:r>
+      <w:r>
+        <w:rPr>
+          <w:rFonts w:ascii="Arial" w:cs="Arial" w:eastAsia="Arial" w:hAnsi="Arial"/>
+          <w:b/>
+          <w:bCs/>
+          <w:sz w:val="21"/>
+          <w:szCs w:val="21"/>
+          <w:rtl/>
+        </w:rPr>
+        <w:t xml:space="preserve">اعتمد المالك Linux مع Docker خلف Caddy (2026-10-24، docs/31 الصف 48)</w:t>
+      </w:r>
+      <w:r>
+        <w:rPr>
+          <w:rFonts w:ascii="Arial" w:cs="Arial" w:eastAsia="Arial" w:hAnsi="Arial"/>
+          <w:b w:val="false"/>
+          <w:bCs w:val="false"/>
+          <w:sz w:val="21"/>
+          <w:szCs w:val="21"/>
+          <w:rtl/>
+        </w:rPr>
+        <w:t xml:space="preserve">، ودليله DOC-S16. وتنطبق عليه الأقسام 6 و7 و8 من هذا المستند، ما عدا الجدار الناري، فله قواعده في DOC-S16 §4.</w:t>
       </w:r>
     </w:p>
     <w:p>

</xml_diff>